<commit_message>
Fix Appendix 2: proper Word 2-column section via sectPr, 8pt code
https://claude.ai/code/session_01HxFi9w1TCfk5sB3VMjfhJ4
</commit_message>
<xml_diff>
--- a/appendix2_program_text.docx
+++ b/appendix2_program_text.docx
@@ -27,9 +27,9 @@
       <w:pPr>
         <w:sectPr>
           <w:type w:val="continuous"/>
-          <w:cols w:num="2" w:space="708"/>
+          <w:cols w:num="1"/>
           <w:pgSz w:w="11906" w:h="16838"/>
-          <w:pgMar w:top="1134" w:right="850" w:bottom="1134" w:left="1701"/>
+          <w:pgMar w:top="1134" w:right="851" w:bottom="1134" w:left="1701" w:header="709" w:footer="709"/>
         </w:sectPr>
       </w:pPr>
     </w:p>
@@ -26130,10 +26130,10 @@
     </w:p>
     <w:p/>
     <w:sectPr>
-      <w:pgSz w:w="12240" w:h="15840"/>
-      <w:pgMar w:top="1134" w:right="850" w:bottom="1134" w:left="1701" w:header="720" w:footer="720" w:gutter="0"/>
-      <w:cols w:space="720"/>
       <w:docGrid w:linePitch="360"/>
+      <w:cols w:num="2" w:space="708" w:equalWidth="1"/>
+      <w:pgMar w:top="1134" w:right="851" w:bottom="1134" w:left="1701" w:header="709" w:footer="709"/>
+      <w:pgSz w:w="11906" w:h="16838"/>
     </w:sectPr>
   </w:body>
 </w:document>

</xml_diff>